<commit_message>
updating the main code and tables generated
</commit_message>
<xml_diff>
--- a/Abstract write up/RSV_Cardiac_KASH2027_Abstract.docx
+++ b/Abstract write up/RSV_Cardiac_KASH2027_Abstract.docx
@@ -163,19 +163,32 @@
           <w:sz w:val="24"/>
           <w:szCs w:val="24"/>
         </w:rPr>
-        <w:t>RSV in Children with Cardiac Disease Hospitalised with Severe Acute Respiratory Illness in Kenya: Surveillance Evidence to Guide Targeted Rollout of RSV Prevention</w:t>
+        <w:t xml:space="preserve">RSV in Children with Cardiac Disease </w:t>
       </w:r>
-    </w:p>
-    <w:p>
-      <w:pPr>
-        <w:spacing w:after="80"/>
-        <w:jc w:val="center"/>
+      <w:proofErr w:type="spellStart"/>
+      <w:r>
         <w:rPr>
           <w:rFonts w:ascii="Times New Roman" w:hAnsi="Times New Roman" w:cs="Times New Roman"/>
+          <w:b/>
+          <w:bCs/>
+          <w:color w:val="7B1A1A"/>
           <w:sz w:val="24"/>
           <w:szCs w:val="24"/>
         </w:rPr>
-      </w:pPr>
+        <w:t>Hospitalised</w:t>
+      </w:r>
+      <w:proofErr w:type="spellEnd"/>
+      <w:r>
+        <w:rPr>
+          <w:rFonts w:ascii="Times New Roman" w:hAnsi="Times New Roman" w:cs="Times New Roman"/>
+          <w:b/>
+          <w:bCs/>
+          <w:color w:val="7B1A1A"/>
+          <w:sz w:val="24"/>
+          <w:szCs w:val="24"/>
+        </w:rPr>
+        <w:t xml:space="preserve"> with Severe Acute Respiratory Illness in Kenya: Surveillance Evidence to Guide Targeted Rollout of RSV Prevention</w:t>
+      </w:r>
     </w:p>
     <w:p>
       <w:pPr>
@@ -293,16 +306,7 @@
                 <w:sz w:val="24"/>
                 <w:szCs w:val="24"/>
               </w:rPr>
-              <w:t>Steve Charo</w:t>
-            </w:r>
-            <w:r>
-              <w:rPr>
-                <w:rFonts w:ascii="Times New Roman" w:hAnsi="Times New Roman" w:cs="Times New Roman"/>
-                <w:color w:val="333333"/>
-                <w:sz w:val="24"/>
-                <w:szCs w:val="24"/>
-              </w:rPr>
-              <w:t>—Study Clinician, KEMRI/CGHR, Kenya</w:t>
+              <w:t>Steve Charo—Study Clinician, KEMRI/CGHR, Kenya</w:t>
             </w:r>
           </w:p>
         </w:tc>
@@ -379,16 +383,7 @@
                 <w:sz w:val="24"/>
                 <w:szCs w:val="24"/>
               </w:rPr>
-              <w:t>{Major}</w:t>
-            </w:r>
-            <w:r>
-              <w:rPr>
-                <w:rFonts w:ascii="Times New Roman" w:hAnsi="Times New Roman" w:cs="Times New Roman"/>
-                <w:color w:val="333333"/>
-                <w:sz w:val="24"/>
-                <w:szCs w:val="24"/>
-              </w:rPr>
-              <w:t xml:space="preserve"> Clinical Medicine  </w:t>
+              <w:t>{Major} Clinical Medicine</w:t>
             </w:r>
           </w:p>
         </w:tc>
@@ -610,7 +605,27 @@
                 <w:sz w:val="24"/>
                 <w:szCs w:val="24"/>
               </w:rPr>
-              <w:t>Children hospitalised with SARI/ILI who had chronic cardiac disease (congenital or rheumatic heart disease, cardiomyopathy, CCF) and were tested for RSV at four Kenyan sentinel hospitals, 2024–2026</w:t>
+              <w:t xml:space="preserve">Children </w:t>
+            </w:r>
+            <w:proofErr w:type="spellStart"/>
+            <w:r>
+              <w:rPr>
+                <w:rFonts w:ascii="Times New Roman" w:hAnsi="Times New Roman" w:cs="Times New Roman"/>
+                <w:color w:val="333333"/>
+                <w:sz w:val="24"/>
+                <w:szCs w:val="24"/>
+              </w:rPr>
+              <w:t>hospitalised</w:t>
+            </w:r>
+            <w:proofErr w:type="spellEnd"/>
+            <w:r>
+              <w:rPr>
+                <w:rFonts w:ascii="Times New Roman" w:hAnsi="Times New Roman" w:cs="Times New Roman"/>
+                <w:color w:val="333333"/>
+                <w:sz w:val="24"/>
+                <w:szCs w:val="24"/>
+              </w:rPr>
+              <w:t xml:space="preserve"> with SARI/ILI who had chronic cardiac disease (congenital or rheumatic heart disease, cardiomyopathy, CCF) and were tested for RSV at four Kenyan sentinel hospitals, 2024–2026</w:t>
             </w:r>
           </w:p>
         </w:tc>
@@ -902,7 +917,16 @@
                 <w:sz w:val="24"/>
                 <w:szCs w:val="24"/>
               </w:rPr>
-              <w:t>Children with heart disease, including congenital and rheumatic heart disease and congestive cardiac failure (CCF), have limited cardiopulmonary reserve and are considered at high risk of severe respiratory syncytial virus (RSV) illness. New RSV preventives (maternal vaccination and long-acting monoclonal antibodies) are becoming available, but supplies and budgets are limited, so countries need local evidence on who to prioritise. Data from Kenya on RSV burden and hospital costs in children with cardiac disease are lacking.</w:t>
+              <w:t xml:space="preserve">Children with cardiac disease, including congenital and rheumatic heart disease and congestive cardiac failure (CCF), have limited cardiopulmonary reserve and are considered at high risk from respiratory syncytial virus (RSV). New RSV preventives (maternal vaccination and long-acting monoclonal antibodies) are becoming available, but supplies and budgets are limited, so countries need local evidence on which children to prioritise. </w:t>
+            </w:r>
+            <w:r>
+              <w:rPr>
+                <w:rFonts w:ascii="Times New Roman" w:hAnsi="Times New Roman" w:cs="Times New Roman"/>
+                <w:color w:val="1A1A1A"/>
+                <w:sz w:val="24"/>
+                <w:szCs w:val="24"/>
+              </w:rPr>
+              <w:t>Data from Kenya on RSV burden and hospital costs in children with cardiac disease are lacking.</w:t>
             </w:r>
           </w:p>
         </w:tc>
@@ -1033,7 +1057,7 @@
                 <w:sz w:val="24"/>
                 <w:szCs w:val="24"/>
               </w:rPr>
-              <w:t>To determine the prevalence of RSV among children with cardiac disease, including heart failure, who are hospitalised with severe acute respiratory illness (SARI).</w:t>
+              <w:t>To determine RSV test positivity among children under five years with cardiac disease, including heart failure, admitted with SARI.</w:t>
             </w:r>
           </w:p>
           <w:p>
@@ -1063,7 +1087,7 @@
                 <w:sz w:val="24"/>
                 <w:szCs w:val="24"/>
               </w:rPr>
-              <w:t>To assess the association between RSV infection and illness severity in these children.</w:t>
+              <w:t>To identify the factors associated with a positive RSV test in this group.</w:t>
             </w:r>
           </w:p>
           <w:p>
@@ -1093,7 +1117,16 @@
                 <w:sz w:val="24"/>
                 <w:szCs w:val="24"/>
               </w:rPr>
-              <w:t>To compare outcomes and hospital resource use (length of stay, bed-days, ICU/acute care use and in-hospital death) between RSV-positive and RSV-negative children, to inform targeted RSV prevention.</w:t>
+              <w:t>To</w:t>
+            </w:r>
+            <w:r>
+              <w:rPr>
+                <w:rFonts w:ascii="Times New Roman" w:hAnsi="Times New Roman" w:cs="Times New Roman"/>
+                <w:color w:val="1A1A1A"/>
+                <w:sz w:val="24"/>
+                <w:szCs w:val="24"/>
+              </w:rPr>
+              <w:t xml:space="preserve"> describe the clinical course and hospital resource use of these admissions by RSV status.</w:t>
             </w:r>
           </w:p>
         </w:tc>
@@ -1226,7 +1259,7 @@
                 <w:sz w:val="24"/>
                 <w:szCs w:val="24"/>
               </w:rPr>
-              <w:t>Secondary analysis of KEMRI/CGHR hospital-based SARI/ILI surveillance data (January 2024–July 2026) from Kenyatta National Hospital and the Mombasa, Siaya and Nyeri sentinel sites.</w:t>
+              <w:t>Secondary analysis of KEMRI/CGHR hospital-based SARI surveillance (January 2024–July 2026) at four sentinel sites: Kenyatta National Hospital, Mombasa, Siaya and Nyeri.</w:t>
             </w:r>
           </w:p>
           <w:p>
@@ -1258,7 +1291,7 @@
                 <w:sz w:val="24"/>
                 <w:szCs w:val="24"/>
               </w:rPr>
-              <w:t>All RSV-tested patients (n = 3,627). Cardiac disease was defined as chronic cardiac disease recorded at enrolment or discharge, or a cardiac diagnosis in the clinical notes (congenital, rheumatic, cardiomyopathy or CCF).</w:t>
+              <w:t>Children aged 0–59 months with cardiac disease — chronic cardiac disease recorded at enrolment or discharge, or a cardiac diagnosis in the clinical notes (congenital, rheumatic, cardiomyopathy or CCF) — admitted under a SARI case definition with an RSV RT-PCR result. Children without cardiac disease were excluded and appear in no analysis.</w:t>
             </w:r>
           </w:p>
           <w:p>
@@ -1280,17 +1313,17 @@
                 <w:sz w:val="24"/>
                 <w:szCs w:val="24"/>
               </w:rPr>
-              <w:t xml:space="preserve">Laboratory: </w:t>
-            </w:r>
-            <w:r>
-              <w:rPr>
-                <w:rFonts w:ascii="Times New Roman" w:hAnsi="Times New Roman" w:cs="Times New Roman"/>
-                <w:bCs/>
-                <w:color w:val="1A1A1A"/>
-                <w:sz w:val="24"/>
-                <w:szCs w:val="24"/>
-              </w:rPr>
-              <w:t>RSV was detected by real-time RT-PCR on nasopharyngeal/oropharyngeal swabs.</w:t>
+              <w:t xml:space="preserve">Outcome: </w:t>
+            </w:r>
+            <w:r>
+              <w:rPr>
+                <w:rFonts w:ascii="Times New Roman" w:hAnsi="Times New Roman" w:cs="Times New Roman"/>
+                <w:bCs/>
+                <w:color w:val="1A1A1A"/>
+                <w:sz w:val="24"/>
+                <w:szCs w:val="24"/>
+              </w:rPr>
+              <w:t>RSV RT-PCR result (positive vs negative) on a nasopharyngeal/oropharyngeal swab.</w:t>
             </w:r>
           </w:p>
           <w:p>
@@ -1312,38 +1345,6 @@
                 <w:sz w:val="24"/>
                 <w:szCs w:val="24"/>
               </w:rPr>
-              <w:t xml:space="preserve">Outcomes: </w:t>
-            </w:r>
-            <w:r>
-              <w:rPr>
-                <w:rFonts w:ascii="Times New Roman" w:hAnsi="Times New Roman" w:cs="Times New Roman"/>
-                <w:bCs/>
-                <w:color w:val="1A1A1A"/>
-                <w:sz w:val="24"/>
-                <w:szCs w:val="24"/>
-              </w:rPr>
-              <w:t>Severity measures were SpO₂ &lt;90%, supplemental oxygen, ICU/acute care unit (ACU) admission, mechanical ventilation, and a composite of any of these or death. We also assessed length of stay (LOS), total bed-days and in-hospital death.</w:t>
-            </w:r>
-          </w:p>
-          <w:p>
-            <w:pPr>
-              <w:spacing w:before="20" w:after="20" w:line="296" w:lineRule="auto"/>
-              <w:jc w:val="both"/>
-              <w:rPr>
-                <w:rFonts w:ascii="Times New Roman" w:hAnsi="Times New Roman" w:cs="Times New Roman"/>
-                <w:sz w:val="24"/>
-                <w:szCs w:val="24"/>
-              </w:rPr>
-            </w:pPr>
-            <w:r>
-              <w:rPr>
-                <w:rFonts w:ascii="Times New Roman" w:hAnsi="Times New Roman" w:cs="Times New Roman"/>
-                <w:b/>
-                <w:bCs/>
-                <w:color w:val="1A1A1A"/>
-                <w:sz w:val="24"/>
-                <w:szCs w:val="24"/>
-              </w:rPr>
               <w:t xml:space="preserve">Analysis: </w:t>
             </w:r>
             <w:r>
@@ -1354,7 +1355,7 @@
                 <w:sz w:val="24"/>
                 <w:szCs w:val="24"/>
               </w:rPr>
-              <w:t>Wilson 95% CIs; Fisher's exact and Mann–Whitney tests; logistic regression adjusted for age, sex and site.</w:t>
+              <w:t>Wilson 95% CIs. Candidate predictors (age group &lt;6, 6–11, 12–23, 24–59 months; sex; sentinel site; heart failure; malnutrition; hospitalisation in the previous 12 months) were screened by likelihood-ratio test; those with p &lt; 0.20, plus age and sex as a priori confounders, entered a binary logistic regression model. Secondary analyses reversed the roles, taking RSV status as the exposure and features of the admission as outcomes, adjusted for age group and sex. All children met the SARI definition and were severely ill by definition, so severity was graded within the group using markers (SpO₂ &lt;90%, ICU/acute care admission, ventilation, death).</w:t>
             </w:r>
           </w:p>
         </w:tc>
@@ -1476,7 +1477,37 @@
                 <w:sz w:val="24"/>
                 <w:szCs w:val="24"/>
               </w:rPr>
-              <w:t>Of 3,627 RSV-tested patients, 279 (7.7%) had cardiac disease (median age 7 months), including 19 with documented heart failure.</w:t>
+              <w:t>Of 3,627 RSV-tested patients</w:t>
+            </w:r>
+            <w:r>
+              <w:rPr>
+                <w:rFonts w:ascii="Times New Roman" w:hAnsi="Times New Roman" w:cs="Times New Roman"/>
+                <w:bCs/>
+                <w:color w:val="1A1A1A"/>
+                <w:sz w:val="24"/>
+                <w:szCs w:val="24"/>
+              </w:rPr>
+              <w:t>, 278</w:t>
+            </w:r>
+            <w:r>
+              <w:rPr>
+                <w:rFonts w:ascii="Times New Roman" w:hAnsi="Times New Roman" w:cs="Times New Roman"/>
+                <w:bCs/>
+                <w:color w:val="1A1A1A"/>
+                <w:sz w:val="24"/>
+                <w:szCs w:val="24"/>
+              </w:rPr>
+              <w:t xml:space="preserve"> (7.7%) </w:t>
+            </w:r>
+            <w:r>
+              <w:rPr>
+                <w:rFonts w:ascii="Times New Roman" w:hAnsi="Times New Roman" w:cs="Times New Roman"/>
+                <w:bCs/>
+                <w:color w:val="1A1A1A"/>
+                <w:sz w:val="24"/>
+                <w:szCs w:val="24"/>
+              </w:rPr>
+              <w:t>children aged 0–59 months with cardiac disease met all criteria, 18 of them with documented heart failure. Median age was 7 months (IQR 4–12); 149/278 (53.6%) were male; 75/278 (27.0%) had malnutrition.</w:t>
             </w:r>
           </w:p>
           <w:p>
@@ -1498,17 +1529,17 @@
                 <w:sz w:val="24"/>
                 <w:szCs w:val="24"/>
               </w:rPr>
-              <w:t xml:space="preserve">Prevalence: </w:t>
-            </w:r>
-            <w:r>
-              <w:rPr>
-                <w:rFonts w:ascii="Times New Roman" w:hAnsi="Times New Roman" w:cs="Times New Roman"/>
-                <w:bCs/>
-                <w:color w:val="1A1A1A"/>
-                <w:sz w:val="24"/>
-                <w:szCs w:val="24"/>
-              </w:rPr>
-              <w:t>RSV was detected in 55/279 children with cardiac disease (19.7%; 95% CI 15.5–24.8), a rate similar to children without cardiac disease (22.7%). Positivity was highest in infants &lt;12 months (22.3%) and was 15.8% (3/19) in children with heart failure.</w:t>
+              <w:t xml:space="preserve">Primary outcome: </w:t>
+            </w:r>
+            <w:r>
+              <w:rPr>
+                <w:rFonts w:ascii="Times New Roman" w:hAnsi="Times New Roman" w:cs="Times New Roman"/>
+                <w:bCs/>
+                <w:color w:val="1A1A1A"/>
+                <w:sz w:val="24"/>
+                <w:szCs w:val="24"/>
+              </w:rPr>
+              <w:t>RSV was detected in 55/278 children (19.8%; 95% CI 15.5–24.9). Positivity was 27/120 (22.5%) at &lt;6 months, 20/91 (22.0%) at 6–11 months, 7/64 (10.9%) at 12–23 months and 1/3 at 24–59 months; 3/18 (16.7%) among children with heart failure.</w:t>
             </w:r>
           </w:p>
           <w:p>
@@ -1530,17 +1561,28 @@
                 <w:sz w:val="24"/>
                 <w:szCs w:val="24"/>
               </w:rPr>
-              <w:t xml:space="preserve">Severity and outcomes: </w:t>
-            </w:r>
-            <w:r>
-              <w:rPr>
-                <w:rFonts w:ascii="Times New Roman" w:hAnsi="Times New Roman" w:cs="Times New Roman"/>
-                <w:bCs/>
-                <w:color w:val="1A1A1A"/>
-                <w:sz w:val="24"/>
-                <w:szCs w:val="24"/>
-              </w:rPr>
-              <w:t>Illness was severe regardless of RSV status. The composite severe outcome occurred in 56.4% of RSV-positive vs 56.2% of RSV-negative children (aOR 0.98; 95% CI 0.53–1.81). ICU/ACU admission (40.0% vs 39.0%), median LOS (14 vs 15 days) and in-hospital death (10.9% vs 15.2%; aOR 0.68, 0.27–1.74) also did not differ. Across all tested patients, cardiac disease independently increased the odds of severe illness (aOR 1.59; 1.22–2.05) and death (aOR 1.89; 1.30–2.74).</w:t>
+              <w:t xml:space="preserve">Predictors: </w:t>
+            </w:r>
+            <w:r>
+              <w:rPr>
+                <w:rFonts w:ascii="Times New Roman" w:hAnsi="Times New Roman" w:cs="Times New Roman"/>
+                <w:bCs/>
+                <w:color w:val="1A1A1A"/>
+                <w:sz w:val="24"/>
+                <w:szCs w:val="24"/>
+              </w:rPr>
+              <w:t xml:space="preserve">Age group met the screening threshold (bivariate p = 0.12) and sex was retained as an a priori confounder; sentinel site (p = 0.92), heart failure (p = 0.67), malnutrition (p = 0.80) and prior hospitalisation (p = 0.78) did not qualify and were not adjusted for. In the </w:t>
+            </w:r>
+            <w:r>
+              <w:rPr>
+                <w:rFonts w:ascii="Times New Roman" w:hAnsi="Times New Roman" w:cs="Times New Roman"/>
+                <w:bCs/>
+                <w:color w:val="1A1A1A"/>
+                <w:sz w:val="24"/>
+                <w:szCs w:val="24"/>
+              </w:rPr>
+              <w:lastRenderedPageBreak/>
+              <w:t>model, children aged ≥12 months had less than half the odds of a positive test compared with infants &lt;6 months (aOR 0.43; 95% CI 0.18–1.02; p = 0.055); sex was not associated (aOR 1.23; 0.67–2.26).</w:t>
             </w:r>
           </w:p>
           <w:p>
@@ -1562,18 +1604,17 @@
                 <w:sz w:val="24"/>
                 <w:szCs w:val="24"/>
               </w:rPr>
-              <w:lastRenderedPageBreak/>
-              <w:t xml:space="preserve">Resource use: </w:t>
-            </w:r>
-            <w:r>
-              <w:rPr>
-                <w:rFonts w:ascii="Times New Roman" w:hAnsi="Times New Roman" w:cs="Times New Roman"/>
-                <w:bCs/>
-                <w:color w:val="1A1A1A"/>
-                <w:sz w:val="24"/>
-                <w:szCs w:val="24"/>
-              </w:rPr>
-              <w:t>The 55 RSV-positive admissions of children with cardiac disease used 1,201 bed-days (mean 22.2 per admission) and 22 ICU/ACU admissions. All 279 children with cardiac disease used 5,379 bed-days.</w:t>
+              <w:t xml:space="preserve">Secondary outcomes: </w:t>
+            </w:r>
+            <w:r>
+              <w:rPr>
+                <w:rFonts w:ascii="Times New Roman" w:hAnsi="Times New Roman" w:cs="Times New Roman"/>
+                <w:bCs/>
+                <w:color w:val="1A1A1A"/>
+                <w:sz w:val="24"/>
+                <w:szCs w:val="24"/>
+              </w:rPr>
+              <w:t>RSV-positive and RSV-negative admissions were clinically alike: ICU/acute care 22/55 vs 86/222, any marker of severe disease 31/55 vs 125/223 (aOR 1.05; 0.57–1.91), in-hospital death 6/55 vs 34/222 (aOR 0.69; 0.27–1.76), median stay 14 vs 15 days (median difference +1 day; −3 to +3). The 55 RSV-positive admissions used 1,201 bed-days; all 278 children used 5,342 bed-days and 40/278 (14.4%) died.</w:t>
             </w:r>
           </w:p>
         </w:tc>
@@ -1698,7 +1739,7 @@
                 <w:sz w:val="24"/>
                 <w:szCs w:val="24"/>
               </w:rPr>
-              <w:t>RSV causes about one in five SARI admissions among Kenyan children with heart disease, a group with nearly double the risk of death and long, costly hospital stays. Once these children are admitted, the underlying cardiac disease rather than RSV drives severity, so the greatest gain is likely to come from preventing RSV infection in the first place. Translating this evidence into impact means prioritising infants with heart disease, and pregnant women where maternal vaccination is used, in any RSV prevention rollout in Kenya. Each RSV admission averted in this group would free about 22 hospital bed-days. Adding a cardiac-disease field to routine SARI surveillance would let the impact of prevention be tracked after rollout.</w:t>
+              <w:t>RSV accounted for about one in five SARI admissions among Kenyan children under five with cardiac disease, and the burden was concentrated in infancy: positivity was roughly twice as high in infants under 12 months as in older children. Once admitted, RSV-positive and RSV-negative children had a similar clinical course, so the gains lie in preventing infection rather than in treating it. RSV prevention aimed at young infants — maternal vaccination and long-acting monoclonal antibodies — would reach the ages where these children are most affected, and children with cardiac disease should be named as a priority group. Adding a cardiac-disease field to routine SARI surveillance would allow the impact to be tracked after rollout. Small numbers (55 RSV-positive, 18 with heart failure) limit precision, and readmission after discharge was not captured.</w:t>
             </w:r>
           </w:p>
         </w:tc>
@@ -2318,7 +2359,7 @@
     <w:name w:val="header"/>
     <w:basedOn w:val="Normal"/>
     <w:link w:val="HeaderChar"/>
-    <w:rsid w:val="00FB0161"/>
+    <w:rsid w:val="00D6087A"/>
     <w:pPr>
       <w:tabs>
         <w:tab w:val="center" w:pos="4680"/>
@@ -2330,7 +2371,7 @@
     <w:name w:val="Header Char"/>
     <w:basedOn w:val="DefaultParagraphFont"/>
     <w:link w:val="Header"/>
-    <w:rsid w:val="00FB0161"/>
+    <w:rsid w:val="00D6087A"/>
     <w:rPr>
       <w:sz w:val="22"/>
       <w:szCs w:val="22"/>
@@ -2340,7 +2381,7 @@
     <w:name w:val="footer"/>
     <w:basedOn w:val="Normal"/>
     <w:link w:val="FooterChar"/>
-    <w:rsid w:val="00FB0161"/>
+    <w:rsid w:val="00D6087A"/>
     <w:pPr>
       <w:tabs>
         <w:tab w:val="center" w:pos="4680"/>
@@ -2352,7 +2393,7 @@
     <w:name w:val="Footer Char"/>
     <w:basedOn w:val="DefaultParagraphFont"/>
     <w:link w:val="Footer"/>
-    <w:rsid w:val="00FB0161"/>
+    <w:rsid w:val="00D6087A"/>
     <w:rPr>
       <w:sz w:val="22"/>
       <w:szCs w:val="22"/>

</xml_diff>